<commit_message>
portability: env/config paths, src_workbook, 새 PC 세팅 설명서
</commit_message>
<xml_diff>
--- a/ckp_reports/CKP_실무자_설명서.docx
+++ b/ckp_reports/CKP_실무자_설명서.docx
@@ -21,7 +21,7 @@
           <w:color w:val="2E5A88"/>
           <w:sz w:val="30"/>
         </w:rPr>
-        <w:t>실무자 설명서</w:t>
+        <w:t>실무자 설명서 (설치 · 실행 · 문제해결)</w:t>
       </w:r>
     </w:p>
     <w:p>
@@ -65,7 +65,7 @@
           <w:color w:val="1F3A5F"/>
           <w:sz w:val="30"/>
         </w:rPr>
-        <w:t>0. 이 프로그램이 하는 일</w:t>
+        <w:t>0. 개요</w:t>
       </w:r>
     </w:p>
     <w:p>
@@ -247,21 +247,6 @@
     </w:tbl>
     <w:p>
       <w:pPr>
-        <w:spacing w:after="120"/>
-      </w:pPr>
-      <w:r>
-        <w:rPr>
-          <w:rFonts w:ascii="Malgun Gothic" w:hAnsi="Malgun Gothic" w:eastAsia="Malgun Gothic"/>
-          <w:b w:val="0"/>
-          <w:i w:val="0"/>
-          <w:color w:val="555555"/>
-          <w:sz w:val="18"/>
-        </w:rPr>
-        <w:t>결과물은 CS-MES/report/CKP_official/ 폴더에 “NO) 리포트명.xlsx” 11개로 저장됩니다.</w:t>
-      </w:r>
-    </w:p>
-    <w:p>
-      <w:pPr>
         <w:spacing w:before="280" w:after="120"/>
       </w:pPr>
       <w:r>
@@ -271,7 +256,25 @@
           <w:color w:val="1F3A5F"/>
           <w:sz w:val="30"/>
         </w:rPr>
-        <w:t>1. Claude Desktop으로 쓰기 (권장)</w:t>
+        <w:t>1. 새 PC에서 처음부터 세팅 (체크리스트)</w:t>
+      </w:r>
+    </w:p>
+    <w:p>
+      <w:pPr>
+        <w:spacing w:before="80" w:after="120"/>
+        <w:shd w:val="clear" w:fill="FFF6E5"/>
+        <w:pBdr>
+          <w:left w:val="single" w:sz="18" w:space="6" w:color="E0A800"/>
+        </w:pBdr>
+      </w:pPr>
+      <w:r>
+        <w:rPr>
+          <w:rFonts w:ascii="Malgun Gothic" w:hAnsi="Malgun Gothic" w:eastAsia="Malgun Gothic"/>
+          <w:b w:val="0"/>
+          <w:color w:val="7A5A00"/>
+          <w:sz w:val="19"/>
+        </w:rPr>
+        <w:t>코드(ckp_reports)만으론 부족합니다. 아래 A~F 를 갖춰야 합니다. 특히 D(Oracle 지갑)·E(SQLcl 저장연결) 는 회사 DB 담당에게 받아야 합니다. 비밀번호·지갑은 보안상 저장소(GitHub)에 없습니다.</w:t>
       </w:r>
     </w:p>
     <w:p>
@@ -285,21 +288,78 @@
           <w:color w:val="2E5A88"/>
           <w:sz w:val="24"/>
         </w:rPr>
-        <w:t>왜 Claude Desktop인가</w:t>
+        <w:t>A. 필수 프로그램 설치</w:t>
       </w:r>
     </w:p>
     <w:p>
       <w:pPr>
-        <w:spacing w:after="120"/>
+        <w:pStyle w:val="ListBullet"/>
+        <w:spacing w:after="40"/>
+      </w:pPr>
+      <w:r>
+        <w:rPr>
+          <w:rFonts w:ascii="Malgun Gothic" w:hAnsi="Malgun Gothic" w:eastAsia="Malgun Gothic"/>
+          <w:b w:val="0"/>
+          <w:sz w:val="20"/>
+        </w:rPr>
+        <w:t>Java 17 (SQLcl 구동용) — Temurin/OpenJDK 17. 설치 후 JAVA_HOME 경로 확인.</w:t>
+      </w:r>
+    </w:p>
+    <w:p>
+      <w:pPr>
+        <w:pStyle w:val="ListBullet"/>
+        <w:spacing w:after="40"/>
+      </w:pPr>
+      <w:r>
+        <w:rPr>
+          <w:rFonts w:ascii="Malgun Gothic" w:hAnsi="Malgun Gothic" w:eastAsia="Malgun Gothic"/>
+          <w:b w:val="0"/>
+          <w:sz w:val="20"/>
+        </w:rPr>
+        <w:t>SQLcl (Oracle) — 압축 풀고 bin/sql 경로 확인. (예: ~/sqlcl/bin/sql)</w:t>
+      </w:r>
+    </w:p>
+    <w:p>
+      <w:pPr>
+        <w:pStyle w:val="ListBullet"/>
+        <w:spacing w:after="40"/>
+      </w:pPr>
+      <w:r>
+        <w:rPr>
+          <w:rFonts w:ascii="Malgun Gothic" w:hAnsi="Malgun Gothic" w:eastAsia="Malgun Gothic"/>
+          <w:b w:val="0"/>
+          <w:sz w:val="20"/>
+        </w:rPr>
+        <w:t>Python 3.9+ — 이후 venv 에 mcp, openpyxl 설치.</w:t>
+      </w:r>
+    </w:p>
+    <w:p>
+      <w:pPr>
+        <w:spacing w:before="180" w:after="80"/>
+      </w:pPr>
+      <w:r>
+        <w:rPr>
+          <w:rFonts w:ascii="Malgun Gothic" w:hAnsi="Malgun Gothic" w:eastAsia="Malgun Gothic"/>
+          <w:b/>
+          <w:color w:val="2E5A88"/>
+          <w:sz w:val="24"/>
+        </w:rPr>
+        <w:t>B. 코드 내려받기 (CS-MES 전체)</w:t>
+      </w:r>
+    </w:p>
+    <w:p>
+      <w:pPr>
+        <w:spacing w:after="40"/>
       </w:pPr>
       <w:r>
         <w:rPr>
           <w:rFonts w:ascii="Malgun Gothic" w:hAnsi="Malgun Gothic" w:eastAsia="Malgun Gothic"/>
           <w:b w:val="0"/>
           <w:i w:val="0"/>
-          <w:sz w:val="21"/>
+          <w:color w:val="555555"/>
+          <w:sz w:val="18"/>
         </w:rPr>
-        <w:t>Claude Desktop의 도구는 사용자 Mac 위에서 실행됩니다. 그래서 SQLcl·파일·메일(SMTP)이 전부 로컬이라 그대로 동작합니다. ckp-reports MCP 서버가 Mac에서 make_all.py를 통째로 실행하므로, 대용량 데이터가 대화 컨텍스트를 지나가지 않아 안정적입니다.</w:t>
+        <w:t>ckp_reports 는 옆 폴더 balance_outgoing_mailer 를 참조하므로 저장소 전체를 받습니다.</w:t>
       </w:r>
     </w:p>
     <w:p>
@@ -320,7 +380,7 @@
           <w:b w:val="0"/>
           <w:sz w:val="18"/>
         </w:rPr>
-        <w:t>Claude Desktop ──(MCP 호출)──▶ ckp-reports 서버 (Mac)</w:t>
+        <w:t>git clone https://github.com/moon081588-lab/CS-MES.git</w:t>
       </w:r>
       <w:r>
         <w:br/>
@@ -331,44 +391,7 @@
           <w:b w:val="0"/>
           <w:sz w:val="18"/>
         </w:rPr>
-        <w:t xml:space="preserve">                                 │ make_all.py ─▶ SQLcl(changshinincaipoc) ─▶ Oracle</w:t>
-      </w:r>
-      <w:r>
-        <w:br/>
-      </w:r>
-      <w:r>
-        <w:rPr>
-          <w:rFonts w:ascii="Consolas" w:hAnsi="Consolas" w:eastAsia="Malgun Gothic"/>
-          <w:b w:val="0"/>
-          <w:sz w:val="18"/>
-        </w:rPr>
-        <w:t xml:space="preserve">                                 │             ─▶ 엑셀 빌더 11종 ─▶ report/CKP_official/</w:t>
-      </w:r>
-      <w:r>
-        <w:br/>
-      </w:r>
-      <w:r>
-        <w:rPr>
-          <w:rFonts w:ascii="Consolas" w:hAnsi="Consolas" w:eastAsia="Malgun Gothic"/>
-          <w:b w:val="0"/>
-          <w:sz w:val="18"/>
-        </w:rPr>
-        <w:t xml:space="preserve">                                 └ mail_reports.py ─▶ Gmail SMTP (ZIP 첨부)</w:t>
-      </w:r>
-    </w:p>
-    <w:p>
-      <w:pPr>
-        <w:spacing w:after="120"/>
-      </w:pPr>
-      <w:r>
-        <w:rPr>
-          <w:rFonts w:ascii="Malgun Gothic" w:hAnsi="Malgun Gothic" w:eastAsia="Malgun Gothic"/>
-          <w:b w:val="0"/>
-          <w:i w:val="0"/>
-          <w:color w:val="555555"/>
-          <w:sz w:val="18"/>
-        </w:rPr>
-        <w:t>DB 조회는 make_all.py가 저장된 SQLcl 연결(ADMIN, 비번 저장됨)로 처리 → 비밀번호·Instant Client·월렛비번 전부 불필요.</w:t>
+        <w:t>cd CS-MES</w:t>
       </w:r>
     </w:p>
     <w:p>
@@ -382,21 +405,7 @@
           <w:color w:val="2E5A88"/>
           <w:sz w:val="24"/>
         </w:rPr>
-        <w:t>1회 설정</w:t>
-      </w:r>
-    </w:p>
-    <w:p>
-      <w:pPr>
-        <w:spacing w:after="40"/>
-      </w:pPr>
-      <w:r>
-        <w:rPr>
-          <w:rFonts w:ascii="Malgun Gothic" w:hAnsi="Malgun Gothic" w:eastAsia="Malgun Gothic"/>
-          <w:b/>
-          <w:i w:val="0"/>
-          <w:sz w:val="21"/>
-        </w:rPr>
-        <w:t>① 라이브러리 (리포트 생성기용 venv — 이미 있으면 재사용)</w:t>
+        <w:t>C. 파이썬 가상환경 + 라이브러리</w:t>
       </w:r>
     </w:p>
     <w:p>
@@ -417,7 +426,7 @@
           <w:b w:val="0"/>
           <w:sz w:val="18"/>
         </w:rPr>
-        <w:t>cd "/Users/nicklee/Library/CloudStorage/OneDrive-postech.ac.kr/CS-MES/balance_outgoing_mailer"</w:t>
+        <w:t>cd balance_outgoing_mailer</w:t>
       </w:r>
       <w:r>
         <w:br/>
@@ -428,7 +437,74 @@
           <w:b w:val="0"/>
           <w:sz w:val="18"/>
         </w:rPr>
-        <w:t>python3 -m venv .venv &amp;&amp; ./.venv/bin/pip install -U mcp openpyxl</w:t>
+        <w:t>python3 -m venv .venv</w:t>
+      </w:r>
+      <w:r>
+        <w:br/>
+      </w:r>
+      <w:r>
+        <w:rPr>
+          <w:rFonts w:ascii="Consolas" w:hAnsi="Consolas" w:eastAsia="Malgun Gothic"/>
+          <w:b w:val="0"/>
+          <w:sz w:val="18"/>
+        </w:rPr>
+        <w:t>./.venv/bin/pip install -U mcp openpyxl</w:t>
+      </w:r>
+    </w:p>
+    <w:p>
+      <w:pPr>
+        <w:spacing w:before="180" w:after="80"/>
+      </w:pPr>
+      <w:r>
+        <w:rPr>
+          <w:rFonts w:ascii="Malgun Gothic" w:hAnsi="Malgun Gothic" w:eastAsia="Malgun Gothic"/>
+          <w:b/>
+          <w:color w:val="2E5A88"/>
+          <w:sz w:val="24"/>
+        </w:rPr>
+        <w:t>D. Oracle 지갑(Wallet) 배치</w:t>
+      </w:r>
+    </w:p>
+    <w:p>
+      <w:pPr>
+        <w:pStyle w:val="ListBullet"/>
+        <w:spacing w:after="40"/>
+      </w:pPr>
+      <w:r>
+        <w:rPr>
+          <w:rFonts w:ascii="Malgun Gothic" w:hAnsi="Malgun Gothic" w:eastAsia="Malgun Gothic"/>
+          <w:b w:val="0"/>
+          <w:sz w:val="20"/>
+        </w:rPr>
+        <w:t>회사 DB 담당에게 Autonomous DB 지갑(zip)을 받아 압축을 풉니다.</w:t>
+      </w:r>
+    </w:p>
+    <w:p>
+      <w:pPr>
+        <w:pStyle w:val="ListBullet"/>
+        <w:spacing w:after="40"/>
+      </w:pPr>
+      <w:r>
+        <w:rPr>
+          <w:rFonts w:ascii="Malgun Gothic" w:hAnsi="Malgun Gothic" w:eastAsia="Malgun Gothic"/>
+          <w:b w:val="0"/>
+          <w:sz w:val="20"/>
+        </w:rPr>
+        <w:t>그 폴더 경로가 TNS_ADMIN 입니다 (tnsnames.ora 가 들어있는 폴더).</w:t>
+      </w:r>
+    </w:p>
+    <w:p>
+      <w:pPr>
+        <w:spacing w:before="180" w:after="80"/>
+      </w:pPr>
+      <w:r>
+        <w:rPr>
+          <w:rFonts w:ascii="Malgun Gothic" w:hAnsi="Malgun Gothic" w:eastAsia="Malgun Gothic"/>
+          <w:b/>
+          <w:color w:val="2E5A88"/>
+          <w:sz w:val="24"/>
+        </w:rPr>
+        <w:t>E. SQLcl 저장연결 만들기 (이름: changshinincaipoc)</w:t>
       </w:r>
     </w:p>
     <w:p>
@@ -438,11 +514,12 @@
       <w:r>
         <w:rPr>
           <w:rFonts w:ascii="Malgun Gothic" w:hAnsi="Malgun Gothic" w:eastAsia="Malgun Gothic"/>
-          <w:b/>
+          <w:b w:val="0"/>
           <w:i w:val="0"/>
-          <w:sz w:val="21"/>
+          <w:color w:val="555555"/>
+          <w:sz w:val="18"/>
         </w:rPr>
-        <w:t>② SQLcl 연결 확인</w:t>
+        <w:t>지갑을 지정하고, 접속을 이름으로 저장(비번 포함)합니다. 한 번만 하면 이후 비번 입력이 필요 없습니다.</w:t>
       </w:r>
     </w:p>
     <w:p>
@@ -463,7 +540,167 @@
           <w:b w:val="0"/>
           <w:sz w:val="18"/>
         </w:rPr>
-        <w:t>/Users/nicklee/sqlcl/bin/sql -S /nolog &lt;&lt;&lt; $'connect -name changshinincaipoc\nselect 1 from dual;\nexit'</w:t>
+        <w:t>export TNS_ADMIN=/받은/지갑/폴더</w:t>
+      </w:r>
+      <w:r>
+        <w:br/>
+      </w:r>
+      <w:r>
+        <w:rPr>
+          <w:rFonts w:ascii="Consolas" w:hAnsi="Consolas" w:eastAsia="Malgun Gothic"/>
+          <w:b w:val="0"/>
+          <w:sz w:val="18"/>
+        </w:rPr>
+        <w:t>~/sqlcl/bin/sql /nolog</w:t>
+      </w:r>
+      <w:r>
+        <w:br/>
+      </w:r>
+      <w:r>
+        <w:rPr>
+          <w:rFonts w:ascii="Consolas" w:hAnsi="Consolas" w:eastAsia="Malgun Gothic"/>
+          <w:b w:val="0"/>
+          <w:sz w:val="18"/>
+        </w:rPr>
+        <w:t>SQL&gt; connect ADMIN@changshinincaipoc_medium        -- DB 비번 입력</w:t>
+      </w:r>
+      <w:r>
+        <w:br/>
+      </w:r>
+      <w:r>
+        <w:rPr>
+          <w:rFonts w:ascii="Consolas" w:hAnsi="Consolas" w:eastAsia="Malgun Gothic"/>
+          <w:b w:val="0"/>
+          <w:sz w:val="18"/>
+        </w:rPr>
+        <w:t>SQL&gt; connmgr save changshinincaipoc -savepwd        -- 이름으로 저장(버전에 따라 conn -save 형태)</w:t>
+      </w:r>
+      <w:r>
+        <w:br/>
+      </w:r>
+      <w:r>
+        <w:rPr>
+          <w:rFonts w:ascii="Consolas" w:hAnsi="Consolas" w:eastAsia="Malgun Gothic"/>
+          <w:b w:val="0"/>
+          <w:sz w:val="18"/>
+        </w:rPr>
+        <w:t>SQL&gt; exit</w:t>
+      </w:r>
+    </w:p>
+    <w:p>
+      <w:pPr>
+        <w:spacing w:before="80" w:after="120"/>
+        <w:shd w:val="clear" w:fill="FFF6E5"/>
+        <w:pBdr>
+          <w:left w:val="single" w:sz="18" w:space="6" w:color="E0A800"/>
+        </w:pBdr>
+      </w:pPr>
+      <w:r>
+        <w:rPr>
+          <w:rFonts w:ascii="Malgun Gothic" w:hAnsi="Malgun Gothic" w:eastAsia="Malgun Gothic"/>
+          <w:b w:val="0"/>
+          <w:color w:val="7A5A00"/>
+          <w:sz w:val="19"/>
+        </w:rPr>
+        <w:t>SQLcl 버전마다 저장 명령이 조금 다릅니다(connmgr / conn -save). DB 담당이 이미 만들어 준 연결을 그대로 복사받는 것이 가장 빠릅니다. 확인: sql -S /nolog 에서 connect -name changshinincaipoc → select 1 from dual; 가 1을 반환하면 OK.</w:t>
+      </w:r>
+    </w:p>
+    <w:p>
+      <w:pPr>
+        <w:spacing w:before="180" w:after="80"/>
+      </w:pPr>
+      <w:r>
+        <w:rPr>
+          <w:rFonts w:ascii="Malgun Gothic" w:hAnsi="Malgun Gothic" w:eastAsia="Malgun Gothic"/>
+          <w:b/>
+          <w:color w:val="2E5A88"/>
+          <w:sz w:val="24"/>
+        </w:rPr>
+        <w:t>F. 설정파일 · 원본 워크북</w:t>
+      </w:r>
+    </w:p>
+    <w:p>
+      <w:pPr>
+        <w:pStyle w:val="ListBullet"/>
+        <w:spacing w:after="40"/>
+      </w:pPr>
+      <w:r>
+        <w:rPr>
+          <w:rFonts w:ascii="Malgun Gothic" w:hAnsi="Malgun Gothic" w:eastAsia="Malgun Gothic"/>
+          <w:b w:val="0"/>
+          <w:sz w:val="20"/>
+        </w:rPr>
+        <w:t>config.ini : balance_outgoing_mailer/config.ini.example 를 복사해 config.ini 로 만들고 값 채우기.</w:t>
+      </w:r>
+    </w:p>
+    <w:p>
+      <w:pPr>
+        <w:pStyle w:val="ListBullet"/>
+        <w:spacing w:after="40"/>
+      </w:pPr>
+      <w:r>
+        <w:rPr>
+          <w:rFonts w:ascii="Malgun Gothic" w:hAnsi="Malgun Gothic" w:eastAsia="Malgun Gothic"/>
+          <w:b w:val="0"/>
+          <w:sz w:val="20"/>
+        </w:rPr>
+        <w:t xml:space="preserve">  · [smtp] password = Gmail 앱 비밀번호(16자리),  from/recipients 지정</w:t>
+      </w:r>
+    </w:p>
+    <w:p>
+      <w:pPr>
+        <w:pStyle w:val="ListBullet"/>
+        <w:spacing w:after="40"/>
+      </w:pPr>
+      <w:r>
+        <w:rPr>
+          <w:rFonts w:ascii="Malgun Gothic" w:hAnsi="Malgun Gothic" w:eastAsia="Malgun Gothic"/>
+          <w:b w:val="0"/>
+          <w:sz w:val="20"/>
+        </w:rPr>
+        <w:t xml:space="preserve">  · [db] wallet_dir = D에서 받은 지갑 폴더 (TNS_ADMIN 미설정 시 폴백으로 사용)</w:t>
+      </w:r>
+    </w:p>
+    <w:p>
+      <w:pPr>
+        <w:pStyle w:val="ListBullet"/>
+        <w:spacing w:after="40"/>
+      </w:pPr>
+      <w:r>
+        <w:rPr>
+          <w:rFonts w:ascii="Malgun Gothic" w:hAnsi="Malgun Gothic" w:eastAsia="Malgun Gothic"/>
+          <w:b w:val="0"/>
+          <w:sz w:val="20"/>
+        </w:rPr>
+        <w:t xml:space="preserve">  · [report] src_workbook = 원본 “CKP Manual Report (종합).xlsx” 전체경로 (No.2 존 양식용)</w:t>
+      </w:r>
+    </w:p>
+    <w:p>
+      <w:pPr>
+        <w:pStyle w:val="ListBullet"/>
+        <w:spacing w:after="40"/>
+      </w:pPr>
+      <w:r>
+        <w:rPr>
+          <w:rFonts w:ascii="Malgun Gothic" w:hAnsi="Malgun Gothic" w:eastAsia="Malgun Gothic"/>
+          <w:b w:val="0"/>
+          <w:sz w:val="20"/>
+        </w:rPr>
+        <w:t>원본 “CKP Manual Report (종합).xlsx” 파일을 확보해 위 src_workbook 에 지정.</w:t>
+      </w:r>
+    </w:p>
+    <w:p>
+      <w:pPr>
+        <w:spacing w:before="280" w:after="120"/>
+      </w:pPr>
+      <w:r>
+        <w:rPr>
+          <w:rFonts w:ascii="Malgun Gothic" w:hAnsi="Malgun Gothic" w:eastAsia="Malgun Gothic"/>
+          <w:b/>
+          <w:color w:val="1F3A5F"/>
+          <w:sz w:val="30"/>
+        </w:rPr>
+        <w:t>2. Claude Desktop에 등록 (권장 실행 경로)</w:t>
       </w:r>
     </w:p>
     <w:p>
@@ -475,10 +712,9 @@
           <w:rFonts w:ascii="Malgun Gothic" w:hAnsi="Malgun Gothic" w:eastAsia="Malgun Gothic"/>
           <w:b w:val="0"/>
           <w:i w:val="0"/>
-          <w:color w:val="555555"/>
-          <w:sz w:val="18"/>
+          <w:sz w:val="21"/>
         </w:rPr>
-        <w:t>→ 숫자 1이 나오면 연결 OK. 메일은 config.ini의 [smtp] password가 Gmail 앱 비밀번호(16자리)인지 확인.</w:t>
+        <w:t>Claude Desktop의 도구는 사용자 PC 위에서 실행되므로, 위 세팅이 되면 “한마디”로 구동됩니다.</w:t>
       </w:r>
     </w:p>
     <w:p>
@@ -492,7 +728,7 @@
           <w:i w:val="0"/>
           <w:sz w:val="21"/>
         </w:rPr>
-        <w:t>③ claude_desktop_config.json 의 mcpServers 에 서버 등록</w:t>
+        <w:t>① claude_desktop_config.json 의 mcpServers 에 서버 등록 (경로는 본인 PC 기준으로 교체)</w:t>
       </w:r>
     </w:p>
     <w:p>
@@ -539,7 +775,7 @@
           <w:b w:val="0"/>
           <w:sz w:val="18"/>
         </w:rPr>
-        <w:t xml:space="preserve">  "command": "/Users/nicklee/Library/CloudStorage/OneDrive-postech.ac.kr/CS-MES/balance_outgoing_mailer/.venv/bin/python",</w:t>
+        <w:t xml:space="preserve">  "command": "&lt;CS-MES&gt;/balance_outgoing_mailer/.venv/bin/python",</w:t>
       </w:r>
       <w:r>
         <w:br/>
@@ -550,7 +786,7 @@
           <w:b w:val="0"/>
           <w:sz w:val="18"/>
         </w:rPr>
-        <w:t xml:space="preserve">  "args": ["/Users/nicklee/Library/CloudStorage/OneDrive-postech.ac.kr/CS-MES/ckp_reports/ckp_mcp.py"],</w:t>
+        <w:t xml:space="preserve">  "args": ["&lt;CS-MES&gt;/ckp_reports/ckp_mcp.py"],</w:t>
       </w:r>
       <w:r>
         <w:br/>
@@ -572,7 +808,7 @@
           <w:b w:val="0"/>
           <w:sz w:val="18"/>
         </w:rPr>
-        <w:t xml:space="preserve">    "SQLCL": "/Users/nicklee/sqlcl/bin/sql",</w:t>
+        <w:t xml:space="preserve">    "SQLCL": "&lt;sqlcl&gt;/bin/sql",</w:t>
       </w:r>
       <w:r>
         <w:br/>
@@ -583,7 +819,7 @@
           <w:b w:val="0"/>
           <w:sz w:val="18"/>
         </w:rPr>
-        <w:t xml:space="preserve">    "TNS_ADMIN": "(sqlcl 항목과 동일한 지갑 폴더 경로)",</w:t>
+        <w:t xml:space="preserve">    "TNS_ADMIN": "&lt;받은 지갑 폴더&gt;",</w:t>
       </w:r>
       <w:r>
         <w:br/>
@@ -594,7 +830,7 @@
           <w:b w:val="0"/>
           <w:sz w:val="18"/>
         </w:rPr>
-        <w:t xml:space="preserve">    "JAVA_HOME": "(sqlcl 항목과 동일)"</w:t>
+        <w:t xml:space="preserve">    "JAVA_HOME": "&lt;JDK17 경로&gt;"</w:t>
       </w:r>
       <w:r>
         <w:br/>
@@ -621,17 +857,20 @@
     </w:p>
     <w:p>
       <w:pPr>
-        <w:spacing w:after="120"/>
+        <w:spacing w:before="80" w:after="120"/>
+        <w:shd w:val="clear" w:fill="FFF6E5"/>
+        <w:pBdr>
+          <w:left w:val="single" w:sz="18" w:space="6" w:color="E0A800"/>
+        </w:pBdr>
       </w:pPr>
       <w:r>
         <w:rPr>
           <w:rFonts w:ascii="Malgun Gothic" w:hAnsi="Malgun Gothic" w:eastAsia="Malgun Gothic"/>
           <w:b w:val="0"/>
-          <w:i w:val="0"/>
-          <w:color w:val="555555"/>
-          <w:sz w:val="18"/>
+          <w:color w:val="7A5A00"/>
+          <w:sz w:val="19"/>
         </w:rPr>
-        <w:t>팁: 기존 sqlcl 항목의 env(TNS_ADMIN·JAVA_HOME·PATH)를 그대로 복사하면 지갑 경로 오타가 없습니다. JSON은 쉼표·따옴표 하나로 깨질 수 있으니, 편집이 부담되면 파이썬으로 안전하게 추가하는 방법을 권장합니다.</w:t>
+        <w:t>&lt;...&gt; 부분을 모두 본인 PC의 실제 경로로 바꾸세요. JSON은 쉼표·따옴표 하나로 깨지므로, 기존 sqlcl 항목의 env(TNS_ADMIN/JAVA_HOME)를 그대로 복사하면 안전합니다.</w:t>
       </w:r>
     </w:p>
     <w:p>
@@ -645,7 +884,7 @@
           <w:i w:val="0"/>
           <w:sz w:val="21"/>
         </w:rPr>
-        <w:t>④ Claude Desktop 완전 종료(⌘Q) 후 재실행 → 도구 3개(ckp_make_all·ckp_mail·ckp_make_and_mail) 로드.</w:t>
+        <w:t>② Claude Desktop 완전 종료(⌘Q) 후 재실행 → 도구 3개 로드.</w:t>
       </w:r>
     </w:p>
     <w:p>
@@ -836,54 +1075,6 @@
                 <w:b w:val="0"/>
                 <w:sz w:val="18"/>
               </w:rPr>
-              <w:t>이미 만든 것 메일만</w:t>
-            </w:r>
-          </w:p>
-        </w:tc>
-        <w:tc>
-          <w:tcPr>
-            <w:tcW w:type="dxa" w:w="4752"/>
-          </w:tcPr>
-          <w:p>
-            <w:r>
-              <w:rPr>
-                <w:rFonts w:ascii="Malgun Gothic" w:hAnsi="Malgun Gothic" w:eastAsia="Malgun Gothic"/>
-                <w:b w:val="0"/>
-                <w:sz w:val="18"/>
-              </w:rPr>
-              <w:t>“방금 CKP 리포트 메일로 보내줘”</w:t>
-            </w:r>
-          </w:p>
-        </w:tc>
-        <w:tc>
-          <w:tcPr>
-            <w:tcW w:type="dxa" w:w="2448"/>
-          </w:tcPr>
-          <w:p>
-            <w:r>
-              <w:rPr>
-                <w:rFonts w:ascii="Malgun Gothic" w:hAnsi="Malgun Gothic" w:eastAsia="Malgun Gothic"/>
-                <w:b w:val="0"/>
-                <w:sz w:val="18"/>
-              </w:rPr>
-              <w:t>ckp_mail</w:t>
-            </w:r>
-          </w:p>
-        </w:tc>
-      </w:tr>
-      <w:tr>
-        <w:tc>
-          <w:tcPr>
-            <w:tcW w:type="dxa" w:w="3312"/>
-            <w:shd w:val="clear" w:fill="F3F6FB"/>
-          </w:tcPr>
-          <w:p>
-            <w:r>
-              <w:rPr>
-                <w:rFonts w:ascii="Malgun Gothic" w:hAnsi="Malgun Gothic" w:eastAsia="Malgun Gothic"/>
-                <w:b w:val="0"/>
-                <w:sz w:val="18"/>
-              </w:rPr>
               <w:t>특정 날짜</w:t>
             </w:r>
           </w:p>
@@ -891,7 +1082,6 @@
         <w:tc>
           <w:tcPr>
             <w:tcW w:type="dxa" w:w="4752"/>
-            <w:shd w:val="clear" w:fill="F3F6FB"/>
           </w:tcPr>
           <w:p>
             <w:r>
@@ -907,7 +1097,6 @@
         <w:tc>
           <w:tcPr>
             <w:tcW w:type="dxa" w:w="2448"/>
-            <w:shd w:val="clear" w:fill="F3F6FB"/>
           </w:tcPr>
           <w:p>
             <w:r>
@@ -933,21 +1122,7 @@
           <w:color w:val="1F3A5F"/>
           <w:sz w:val="30"/>
         </w:rPr>
-        <w:t>2. 터미널(명령줄)로 쓰기</w:t>
-      </w:r>
-    </w:p>
-    <w:p>
-      <w:pPr>
-        <w:spacing w:after="120"/>
-      </w:pPr>
-      <w:r>
-        <w:rPr>
-          <w:rFonts w:ascii="Malgun Gothic" w:hAnsi="Malgun Gothic" w:eastAsia="Malgun Gothic"/>
-          <w:b w:val="0"/>
-          <w:i w:val="0"/>
-          <w:sz w:val="21"/>
-        </w:rPr>
-        <w:t>Claude Desktop 없이, SQLcl이 있는 Mac/서버에서 두 줄로 동일하게 실행할 수 있습니다.</w:t>
+        <w:t>3. 터미널로 쓰기 (Claude Desktop 없이)</w:t>
       </w:r>
     </w:p>
     <w:p>
@@ -968,7 +1143,7 @@
           <w:b w:val="0"/>
           <w:sz w:val="18"/>
         </w:rPr>
-        <w:t>cd "/Users/nicklee/Library/CloudStorage/OneDrive-postech.ac.kr/CS-MES/ckp_reports"</w:t>
+        <w:t>cd "&lt;CS-MES&gt;/ckp_reports"</w:t>
       </w:r>
       <w:r>
         <w:br/>
@@ -979,7 +1154,7 @@
           <w:b w:val="0"/>
           <w:sz w:val="18"/>
         </w:rPr>
-        <w:t>python3 make_all.py 2026-07-07       # ① 11개 리포트 생성</w:t>
+        <w:t>python3 make_all.py 2026-07-07       # 11개 생성</w:t>
       </w:r>
       <w:r>
         <w:br/>
@@ -990,7 +1165,7 @@
           <w:b w:val="0"/>
           <w:sz w:val="18"/>
         </w:rPr>
-        <w:t>python3 mail_reports.py 2026-07-07   # ② 11개 ZIP 첨부 발송</w:t>
+        <w:t>python3 mail_reports.py 2026-07-07   # ZIP 첨부 발송</w:t>
       </w:r>
     </w:p>
     <w:p>
@@ -1005,56 +1180,7 @@
           <w:color w:val="555555"/>
           <w:sz w:val="18"/>
         </w:rPr>
-        <w:t>날짜 인자를 생략하면 오늘 날짜로 실행됩니다. 원본 워크북 경로가 다르면 make_all.py 에 --src "CKP Manual Report (종합).xlsx 경로" 를 붙이세요.</w:t>
-      </w:r>
-    </w:p>
-    <w:p>
-      <w:pPr>
-        <w:spacing w:before="180" w:after="80"/>
-      </w:pPr>
-      <w:r>
-        <w:rPr>
-          <w:rFonts w:ascii="Malgun Gothic" w:hAnsi="Malgun Gothic" w:eastAsia="Malgun Gothic"/>
-          <w:b/>
-          <w:color w:val="2E5A88"/>
-          <w:sz w:val="24"/>
-        </w:rPr>
-        <w:t>매일 자동 실행 (선택)</w:t>
-      </w:r>
-    </w:p>
-    <w:p>
-      <w:pPr>
-        <w:spacing w:after="40"/>
-      </w:pPr>
-      <w:r>
-        <w:rPr>
-          <w:rFonts w:ascii="Malgun Gothic" w:hAnsi="Malgun Gothic" w:eastAsia="Malgun Gothic"/>
-          <w:b w:val="0"/>
-          <w:i w:val="0"/>
-          <w:sz w:val="21"/>
-        </w:rPr>
-        <w:t>macOS launchd 로 매일 08:00 자동 실행하려면 ~/Library/LaunchAgents/ 에 plist 를 두고 launchctl load. 핵심은 아래 한 줄을 스케줄에 거는 것입니다.</w:t>
-      </w:r>
-    </w:p>
-    <w:p>
-      <w:pPr>
-        <w:spacing w:before="60" w:after="120"/>
-        <w:ind w:left="144"/>
-        <w:shd w:val="clear" w:fill="F2F3F5"/>
-        <w:pBdr>
-          <w:top w:val="single" w:sz="6" w:space="4" w:color="CCCCCC"/>
-          <w:bottom w:val="single" w:sz="6" w:space="4" w:color="CCCCCC"/>
-          <w:left w:val="single" w:sz="6" w:space="4" w:color="CCCCCC"/>
-          <w:right w:val="single" w:sz="6" w:space="4" w:color="CCCCCC"/>
-        </w:pBdr>
-      </w:pPr>
-      <w:r>
-        <w:rPr>
-          <w:rFonts w:ascii="Consolas" w:hAnsi="Consolas" w:eastAsia="Malgun Gothic"/>
-          <w:b w:val="0"/>
-          <w:sz w:val="18"/>
-        </w:rPr>
-        <w:t>cd "$HOME/.../CS-MES/ckp_reports" &amp;&amp; python3 make_all.py &amp;&amp; python3 mail_reports.py</w:t>
+        <w:t>터미널에서는 SQLcl이 지갑을 찾도록 TNS_ADMIN/JAVA_HOME 을 export 하거나, config.ini [db] wallet_dir 를 채워두세요. 매일 자동 실행은 launchd/cron 에 위 두 줄을 걸면 됩니다.</w:t>
       </w:r>
     </w:p>
     <w:p>
@@ -1068,7 +1194,7 @@
           <w:color w:val="1F3A5F"/>
           <w:sz w:val="30"/>
         </w:rPr>
-        <w:t>3. 리포트 11종 · 데이터 소스</w:t>
+        <w:t>4. 리포트 11종 · 데이터 소스</w:t>
       </w:r>
     </w:p>
     <w:tbl>
@@ -1859,7 +1985,7 @@
     </w:tbl>
     <w:p>
       <w:pPr>
-        <w:spacing w:after="80"/>
+        <w:spacing w:after="120"/>
       </w:pPr>
       <w:r>
         <w:rPr>
@@ -1869,7 +1995,7 @@
           <w:color w:val="555555"/>
           <w:sz w:val="18"/>
         </w:rPr>
-        <w:t>모든 SQL은 balance_sql.py 한 곳에 있습니다.</w:t>
+        <w:t>모든 SQL은 balance_sql.py 한 곳에 있습니다. 사이즈·날짜(D-offset) 컬럼은 원본 고정 구조라 데이터가 0행이어도 열이 사라지지 않습니다.</w:t>
       </w:r>
     </w:p>
     <w:p>
@@ -1883,49 +2009,7 @@
           <w:color w:val="2E5A88"/>
           <w:sz w:val="24"/>
         </w:rPr>
-        <w:t>양식 원칙</w:t>
-      </w:r>
-    </w:p>
-    <w:p>
-      <w:pPr>
-        <w:pStyle w:val="ListBullet"/>
-        <w:spacing w:after="40"/>
-      </w:pPr>
-      <w:r>
-        <w:rPr>
-          <w:rFonts w:ascii="Malgun Gothic" w:hAnsi="Malgun Gothic" w:eastAsia="Malgun Gothic"/>
-          <w:b w:val="0"/>
-          <w:sz w:val="20"/>
-        </w:rPr>
-        <w:t>사이즈 컬럼(1~18, OS&amp;D는 1~17)과 날짜 컬럼(D+N…D-Day…D-7)은 원본 고정 구조로 항상 렌더됩니다.</w:t>
-      </w:r>
-    </w:p>
-    <w:p>
-      <w:pPr>
-        <w:pStyle w:val="ListBullet"/>
-        <w:spacing w:after="40"/>
-      </w:pPr>
-      <w:r>
-        <w:rPr>
-          <w:rFonts w:ascii="Malgun Gothic" w:hAnsi="Malgun Gothic" w:eastAsia="Malgun Gothic"/>
-          <w:b w:val="0"/>
-          <w:sz w:val="20"/>
-        </w:rPr>
-        <w:t>→ 데이터가 0행이어도 열이 사라지지 않습니다. (예: No.7 CMP가 0행이어도 날짜열 14개 유지)</w:t>
-      </w:r>
-    </w:p>
-    <w:p>
-      <w:pPr>
-        <w:spacing w:before="180" w:after="80"/>
-      </w:pPr>
-      <w:r>
-        <w:rPr>
-          <w:rFonts w:ascii="Malgun Gothic" w:hAnsi="Malgun Gothic" w:eastAsia="Malgun Gothic"/>
-          <w:b/>
-          <w:color w:val="2E5A88"/>
-          <w:sz w:val="24"/>
-        </w:rPr>
-        <w:t>아직 빈칸인 컬럼 (소스 미확정 — 확인되면 해당 빌더 한 곳만 채우면 됨)</w:t>
+        <w:t>아직 빈칸인 컬럼 (소스 확인되면 해당 빌더 한 곳만 채우면 됨)</w:t>
       </w:r>
     </w:p>
     <w:p>
@@ -1955,22 +2039,7 @@
           <w:color w:val="B02A2A"/>
           <w:sz w:val="20"/>
         </w:rPr>
-        <w:t>No.1: YIELD, TARGET, OS&amp;D, TOTAL Kg</w:t>
-      </w:r>
-    </w:p>
-    <w:p>
-      <w:pPr>
-        <w:pStyle w:val="ListBullet"/>
-        <w:spacing w:after="40"/>
-      </w:pPr>
-      <w:r>
-        <w:rPr>
-          <w:rFonts w:ascii="Malgun Gothic" w:hAnsi="Malgun Gothic" w:eastAsia="Malgun Gothic"/>
-          <w:b w:val="0"/>
-          <w:color w:val="B02A2A"/>
-          <w:sz w:val="20"/>
-        </w:rPr>
-        <w:t>No.2: STOCK CKP, STOCK SPRAY, BTM SET, Set Bal Stock</w:t>
+        <w:t>No.1: YIELD, TARGET, OS&amp;D, TOTAL Kg   ·   No.2: STOCK CKP/SPRAY, BTM SET, Set Bal Stock</w:t>
       </w:r>
     </w:p>
     <w:p>
@@ -1984,7 +2053,7 @@
           <w:color w:val="1F3A5F"/>
           <w:sz w:val="30"/>
         </w:rPr>
-        <w:t>4. 문제 해결</w:t>
+        <w:t>5. 문제 해결</w:t>
       </w:r>
     </w:p>
     <w:tbl>
@@ -2095,7 +2164,7 @@
                 <w:b w:val="0"/>
                 <w:sz w:val="18"/>
               </w:rPr>
-              <w:t>TNS_ADMIN 미설정. sqlcl 항목의 TNS_ADMIN 을 ckp-reports env 에 복사 (make_all.py 에 폴백 내장)</w:t>
+              <w:t>TNS_ADMIN 미설정. 지갑 폴더를 ckp-reports env(TNS_ADMIN) 또는 config wallet_dir 에 지정</w:t>
             </w:r>
           </w:p>
         </w:tc>
@@ -2112,6 +2181,39 @@
                 <w:b w:val="0"/>
                 <w:sz w:val="18"/>
               </w:rPr>
+              <w:t>No.2 만 실패 / xlsx 오류</w:t>
+            </w:r>
+          </w:p>
+        </w:tc>
+        <w:tc>
+          <w:tcPr>
+            <w:tcW w:type="dxa" w:w="7200"/>
+          </w:tcPr>
+          <w:p>
+            <w:r>
+              <w:rPr>
+                <w:rFonts w:ascii="Malgun Gothic" w:hAnsi="Malgun Gothic" w:eastAsia="Malgun Gothic"/>
+                <w:b w:val="0"/>
+                <w:sz w:val="18"/>
+              </w:rPr>
+              <w:t>src_workbook(원본 워크북) 경로 미지정. config [report] src_workbook 또는 --src 로 지정</w:t>
+            </w:r>
+          </w:p>
+        </w:tc>
+      </w:tr>
+      <w:tr>
+        <w:tc>
+          <w:tcPr>
+            <w:tcW w:type="dxa" w:w="3312"/>
+            <w:shd w:val="clear" w:fill="F3F6FB"/>
+          </w:tcPr>
+          <w:p>
+            <w:r>
+              <w:rPr>
+                <w:rFonts w:ascii="Malgun Gothic" w:hAnsi="Malgun Gothic" w:eastAsia="Malgun Gothic"/>
+                <w:b w:val="0"/>
+                <w:sz w:val="18"/>
+              </w:rPr>
               <w:t>SQL 오류 / 파싱 실패</w:t>
             </w:r>
           </w:p>
@@ -2119,6 +2221,7 @@
         <w:tc>
           <w:tcPr>
             <w:tcW w:type="dxa" w:w="7200"/>
+            <w:shd w:val="clear" w:fill="F3F6FB"/>
           </w:tcPr>
           <w:p>
             <w:r>
@@ -2136,7 +2239,6 @@
         <w:tc>
           <w:tcPr>
             <w:tcW w:type="dxa" w:w="3312"/>
-            <w:shd w:val="clear" w:fill="F3F6FB"/>
           </w:tcPr>
           <w:p>
             <w:r>
@@ -2152,7 +2254,6 @@
         <w:tc>
           <w:tcPr>
             <w:tcW w:type="dxa" w:w="7200"/>
-            <w:shd w:val="clear" w:fill="F3F6FB"/>
           </w:tcPr>
           <w:p>
             <w:r>
@@ -2170,6 +2271,7 @@
         <w:tc>
           <w:tcPr>
             <w:tcW w:type="dxa" w:w="3312"/>
+            <w:shd w:val="clear" w:fill="F3F6FB"/>
           </w:tcPr>
           <w:p>
             <w:r>
@@ -2185,6 +2287,7 @@
         <w:tc>
           <w:tcPr>
             <w:tcW w:type="dxa" w:w="7200"/>
+            <w:shd w:val="clear" w:fill="F3F6FB"/>
           </w:tcPr>
           <w:p>
             <w:r>
@@ -2202,7 +2305,6 @@
         <w:tc>
           <w:tcPr>
             <w:tcW w:type="dxa" w:w="3312"/>
-            <w:shd w:val="clear" w:fill="F3F6FB"/>
           </w:tcPr>
           <w:p>
             <w:r>
@@ -2218,7 +2320,6 @@
         <w:tc>
           <w:tcPr>
             <w:tcW w:type="dxa" w:w="7200"/>
-            <w:shd w:val="clear" w:fill="F3F6FB"/>
           </w:tcPr>
           <w:p>
             <w:r>
@@ -2244,119 +2345,7 @@
           <w:color w:val="1F3A5F"/>
           <w:sz w:val="30"/>
         </w:rPr>
-        <w:t>5. 파일 구성 · 보안</w:t>
-      </w:r>
-    </w:p>
-    <w:p>
-      <w:pPr>
-        <w:spacing w:before="60" w:after="120"/>
-        <w:ind w:left="144"/>
-        <w:shd w:val="clear" w:fill="F2F3F5"/>
-        <w:pBdr>
-          <w:top w:val="single" w:sz="6" w:space="4" w:color="CCCCCC"/>
-          <w:bottom w:val="single" w:sz="6" w:space="4" w:color="CCCCCC"/>
-          <w:left w:val="single" w:sz="6" w:space="4" w:color="CCCCCC"/>
-          <w:right w:val="single" w:sz="6" w:space="4" w:color="CCCCCC"/>
-        </w:pBdr>
-      </w:pPr>
-      <w:r>
-        <w:rPr>
-          <w:rFonts w:ascii="Consolas" w:hAnsi="Consolas" w:eastAsia="Malgun Gothic"/>
-          <w:b w:val="0"/>
-          <w:sz w:val="18"/>
-        </w:rPr>
-        <w:t>ckp_reports/</w:t>
-      </w:r>
-      <w:r>
-        <w:br/>
-      </w:r>
-      <w:r>
-        <w:rPr>
-          <w:rFonts w:ascii="Consolas" w:hAnsi="Consolas" w:eastAsia="Malgun Gothic"/>
-          <w:b w:val="0"/>
-          <w:sz w:val="18"/>
-        </w:rPr>
-        <w:t>├─ make_all.py       11개 생성 오케스트레이터 (SQLcl 사용)</w:t>
-      </w:r>
-      <w:r>
-        <w:br/>
-      </w:r>
-      <w:r>
-        <w:rPr>
-          <w:rFonts w:ascii="Consolas" w:hAnsi="Consolas" w:eastAsia="Malgun Gothic"/>
-          <w:b w:val="0"/>
-          <w:sz w:val="18"/>
-        </w:rPr>
-        <w:t>├─ mail_reports.py   11개 ZIP 첨부 메일 발송 (SMTP)</w:t>
-      </w:r>
-      <w:r>
-        <w:br/>
-      </w:r>
-      <w:r>
-        <w:rPr>
-          <w:rFonts w:ascii="Consolas" w:hAnsi="Consolas" w:eastAsia="Malgun Gothic"/>
-          <w:b w:val="0"/>
-          <w:sz w:val="18"/>
-        </w:rPr>
-        <w:t>├─ ckp_mcp.py        Claude Desktop용 MCP (ckp_make_all/ckp_mail/ckp_make_and_mail)</w:t>
-      </w:r>
-      <w:r>
-        <w:br/>
-      </w:r>
-      <w:r>
-        <w:rPr>
-          <w:rFonts w:ascii="Consolas" w:hAnsi="Consolas" w:eastAsia="Malgun Gothic"/>
-          <w:b w:val="0"/>
-          <w:sz w:val="18"/>
-        </w:rPr>
-        <w:t>├─ balance_sql.py    모든 리포트의 SQL 생성기</w:t>
-      </w:r>
-      <w:r>
-        <w:br/>
-      </w:r>
-      <w:r>
-        <w:rPr>
-          <w:rFonts w:ascii="Consolas" w:hAnsi="Consolas" w:eastAsia="Malgun Gothic"/>
-          <w:b w:val="0"/>
-          <w:sz w:val="18"/>
-        </w:rPr>
-        <w:t>├─ bysize_v2 / balance_bydate / osnd_pivot / daily_scan / no2_zone   빌더</w:t>
-      </w:r>
-      <w:r>
-        <w:br/>
-      </w:r>
-      <w:r>
-        <w:rPr>
-          <w:rFonts w:ascii="Consolas" w:hAnsi="Consolas" w:eastAsia="Malgun Gothic"/>
-          <w:b w:val="0"/>
-          <w:sz w:val="18"/>
-        </w:rPr>
-        <w:t>├─ CLAUDE_DESKTOP.md  SETUP.md   (설명서 원본)</w:t>
-      </w:r>
-      <w:r>
-        <w:br/>
-      </w:r>
-      <w:r>
-        <w:rPr>
-          <w:rFonts w:ascii="Consolas" w:hAnsi="Consolas" w:eastAsia="Malgun Gothic"/>
-          <w:b w:val="0"/>
-          <w:sz w:val="18"/>
-        </w:rPr>
-        <w:t>report/CKP_official/  생성 결과 11개   ·   report/Past Reports/  구버전 보관</w:t>
-      </w:r>
-    </w:p>
-    <w:p>
-      <w:pPr>
-        <w:spacing w:before="180" w:after="80"/>
-      </w:pPr>
-      <w:r>
-        <w:rPr>
-          <w:rFonts w:ascii="Malgun Gothic" w:hAnsi="Malgun Gothic" w:eastAsia="Malgun Gothic"/>
-          <w:b/>
-          <w:color w:val="2E5A88"/>
-          <w:sz w:val="24"/>
-        </w:rPr>
-        <w:t>보안 주의</w:t>
+        <w:t>6. 보안 주의</w:t>
       </w:r>
     </w:p>
     <w:p>
@@ -2384,7 +2373,7 @@
           <w:b w:val="0"/>
           <w:sz w:val="20"/>
         </w:rPr>
-        <w:t>비밀번호는 파일에만 두고 채팅·이슈에 붙여넣지 마세요.</w:t>
+        <w:t>비밀번호·지갑은 파일/보안 채널로만 전달하고, 채팅·이슈에 붙여넣지 마세요.</w:t>
       </w:r>
     </w:p>
     <w:sectPr>

</xml_diff>